<commit_message>
update on lesson 4
</commit_message>
<xml_diff>
--- a/Electrical/Level 3 - 2365/4 - Lesson/Write-Up/4 -Lesson.docx
+++ b/Electrical/Level 3 - 2365/4 - Lesson/Write-Up/4 -Lesson.docx
@@ -117,12 +117,12 @@
           <wp:inline distB="114300" distT="114300" distL="114300" distR="114300">
             <wp:extent cx="3548063" cy="2547811"/>
             <wp:effectExtent b="50800" l="50800" r="50800" t="50800"/>
-            <wp:docPr id="4" name="image7.png"/>
+            <wp:docPr id="4" name="image5.png"/>
             <a:graphic>
               <a:graphicData uri="http://schemas.openxmlformats.org/drawingml/2006/picture">
                 <pic:pic>
                   <pic:nvPicPr>
-                    <pic:cNvPr id="0" name="image7.png"/>
+                    <pic:cNvPr id="0" name="image5.png"/>
                     <pic:cNvPicPr preferRelativeResize="0"/>
                   </pic:nvPicPr>
                   <pic:blipFill>
@@ -250,12 +250,12 @@
           <wp:inline distB="114300" distT="114300" distL="114300" distR="114300">
             <wp:extent cx="4505325" cy="3714750"/>
             <wp:effectExtent b="25400" l="25400" r="25400" t="25400"/>
-            <wp:docPr id="8" name="image8.png"/>
+            <wp:docPr id="8" name="image1.png"/>
             <a:graphic>
               <a:graphicData uri="http://schemas.openxmlformats.org/drawingml/2006/picture">
                 <pic:pic>
                   <pic:nvPicPr>
-                    <pic:cNvPr id="0" name="image8.png"/>
+                    <pic:cNvPr id="0" name="image1.png"/>
                     <pic:cNvPicPr preferRelativeResize="0"/>
                   </pic:nvPicPr>
                   <pic:blipFill>
@@ -363,12 +363,12 @@
           <wp:inline distB="114300" distT="114300" distL="114300" distR="114300">
             <wp:extent cx="4810125" cy="3924300"/>
             <wp:effectExtent b="25400" l="25400" r="25400" t="25400"/>
-            <wp:docPr id="3" name="image5.png"/>
+            <wp:docPr id="3" name="image3.png"/>
             <a:graphic>
               <a:graphicData uri="http://schemas.openxmlformats.org/drawingml/2006/picture">
                 <pic:pic>
                   <pic:nvPicPr>
-                    <pic:cNvPr id="0" name="image5.png"/>
+                    <pic:cNvPr id="0" name="image3.png"/>
                     <pic:cNvPicPr preferRelativeResize="0"/>
                   </pic:nvPicPr>
                   <pic:blipFill>
@@ -563,12 +563,12 @@
           <wp:inline distB="114300" distT="114300" distL="114300" distR="114300">
             <wp:extent cx="5534025" cy="3048000"/>
             <wp:effectExtent b="25400" l="25400" r="25400" t="25400"/>
-            <wp:docPr id="7" name="image3.png"/>
+            <wp:docPr id="7" name="image7.png"/>
             <a:graphic>
               <a:graphicData uri="http://schemas.openxmlformats.org/drawingml/2006/picture">
                 <pic:pic>
                   <pic:nvPicPr>
-                    <pic:cNvPr id="0" name="image3.png"/>
+                    <pic:cNvPr id="0" name="image7.png"/>
                     <pic:cNvPicPr preferRelativeResize="0"/>
                   </pic:nvPicPr>
                   <pic:blipFill>
@@ -748,12 +748,12 @@
           <wp:inline distB="114300" distT="114300" distL="114300" distR="114300">
             <wp:extent cx="4886325" cy="3752850"/>
             <wp:effectExtent b="25400" l="25400" r="25400" t="25400"/>
-            <wp:docPr id="9" name="image4.png"/>
+            <wp:docPr id="9" name="image9.png"/>
             <a:graphic>
               <a:graphicData uri="http://schemas.openxmlformats.org/drawingml/2006/picture">
                 <pic:pic>
                   <pic:nvPicPr>
-                    <pic:cNvPr id="0" name="image4.png"/>
+                    <pic:cNvPr id="0" name="image9.png"/>
                     <pic:cNvPicPr preferRelativeResize="0"/>
                   </pic:nvPicPr>
                   <pic:blipFill>
@@ -998,12 +998,12 @@
           <wp:inline distB="114300" distT="114300" distL="114300" distR="114300">
             <wp:extent cx="5731200" cy="2413000"/>
             <wp:effectExtent b="25400" l="25400" r="25400" t="25400"/>
-            <wp:docPr id="5" name="image1.png"/>
+            <wp:docPr id="5" name="image2.png"/>
             <a:graphic>
               <a:graphicData uri="http://schemas.openxmlformats.org/drawingml/2006/picture">
                 <pic:pic>
                   <pic:nvPicPr>
-                    <pic:cNvPr id="0" name="image1.png"/>
+                    <pic:cNvPr id="0" name="image2.png"/>
                     <pic:cNvPicPr preferRelativeResize="0"/>
                   </pic:nvPicPr>
                   <pic:blipFill>
@@ -1108,12 +1108,12 @@
           <wp:inline distB="114300" distT="114300" distL="114300" distR="114300">
             <wp:extent cx="5019675" cy="3819525"/>
             <wp:effectExtent b="25400" l="25400" r="25400" t="25400"/>
-            <wp:docPr id="2" name="image6.png"/>
+            <wp:docPr id="2" name="image4.png"/>
             <a:graphic>
               <a:graphicData uri="http://schemas.openxmlformats.org/drawingml/2006/picture">
                 <pic:pic>
                   <pic:nvPicPr>
-                    <pic:cNvPr id="0" name="image6.png"/>
+                    <pic:cNvPr id="0" name="image4.png"/>
                     <pic:cNvPicPr preferRelativeResize="0"/>
                   </pic:nvPicPr>
                   <pic:blipFill>
@@ -1238,12 +1238,12 @@
           <wp:inline distB="114300" distT="114300" distL="114300" distR="114300">
             <wp:extent cx="5731200" cy="2362200"/>
             <wp:effectExtent b="25400" l="25400" r="25400" t="25400"/>
-            <wp:docPr id="1" name="image2.png"/>
+            <wp:docPr id="1" name="image8.png"/>
             <a:graphic>
               <a:graphicData uri="http://schemas.openxmlformats.org/drawingml/2006/picture">
                 <pic:pic>
                   <pic:nvPicPr>
-                    <pic:cNvPr id="0" name="image2.png"/>
+                    <pic:cNvPr id="0" name="image8.png"/>
                     <pic:cNvPicPr preferRelativeResize="0"/>
                   </pic:nvPicPr>
                   <pic:blipFill>
@@ -1300,6 +1300,22 @@
     </w:p>
     <w:p>
       <w:pPr>
+        <w:rPr>
+          <w:b w:val="1"/>
+          <w:bCs w:val="1"/>
+        </w:rPr>
+      </w:pPr>
+      <w:r>
+        <w:rPr>
+          <w:b w:val="1"/>
+          <w:bCs w:val="1"/>
+          <w:rtl w:val="0"/>
+        </w:rPr>
+        <w:t xml:space="preserve">Image AA</w:t>
+      </w:r>
+    </w:p>
+    <w:p>
+      <w:pPr>
         <w:rPr/>
       </w:pPr>
       <w:r>
@@ -1308,12 +1324,12 @@
           <wp:inline distB="114300" distT="114300" distL="114300" distR="114300">
             <wp:extent cx="5731200" cy="2463800"/>
             <wp:effectExtent b="25400" l="25400" r="25400" t="25400"/>
-            <wp:docPr id="6" name="image9.png"/>
+            <wp:docPr id="6" name="image6.png"/>
             <a:graphic>
               <a:graphicData uri="http://schemas.openxmlformats.org/drawingml/2006/picture">
                 <pic:pic>
                   <pic:nvPicPr>
-                    <pic:cNvPr id="0" name="image9.png"/>
+                    <pic:cNvPr id="0" name="image6.png"/>
                     <pic:cNvPicPr preferRelativeResize="0"/>
                   </pic:nvPicPr>
                   <pic:blipFill>
@@ -1414,6 +1430,20 @@
       </w:r>
       <w:r>
         <w:rPr>
+          <w:b w:val="1"/>
+          <w:bCs w:val="1"/>
+          <w:rtl w:val="0"/>
+        </w:rPr>
+        <w:t xml:space="preserve">Image AA</w:t>
+      </w:r>
+      <w:r>
+        <w:rPr>
+          <w:rtl w:val="0"/>
+        </w:rPr>
+        <w:t xml:space="preserve"> </w:t>
+      </w:r>
+      <w:r>
+        <w:rPr>
           <w:color w:val="ff9900"/>
           <w:rtl w:val="0"/>
         </w:rPr>
@@ -1430,6 +1460,183 @@
         <w:rPr>
           <w:rtl w:val="0"/>
         </w:rPr>
+      </w:r>
+    </w:p>
+    <w:p>
+      <w:pPr>
+        <w:rPr/>
+      </w:pPr>
+      <w:r>
+        <w:rPr>
+          <w:rtl w:val="0"/>
+        </w:rPr>
+      </w:r>
+    </w:p>
+    <w:p>
+      <w:pPr>
+        <w:rPr/>
+      </w:pPr>
+      <w:r>
+        <w:rPr>
+          <w:rtl w:val="0"/>
+        </w:rPr>
+      </w:r>
+    </w:p>
+    <w:p>
+      <w:pPr>
+        <w:rPr/>
+      </w:pPr>
+      <w:r>
+        <w:rPr>
+          <w:rtl w:val="0"/>
+        </w:rPr>
+      </w:r>
+    </w:p>
+    <w:p>
+      <w:pPr>
+        <w:rPr/>
+      </w:pPr>
+      <w:r>
+        <w:rPr>
+          <w:rtl w:val="0"/>
+        </w:rPr>
+      </w:r>
+    </w:p>
+    <w:p>
+      <w:pPr>
+        <w:rPr/>
+      </w:pPr>
+      <w:r>
+        <w:rPr>
+          <w:rtl w:val="0"/>
+        </w:rPr>
+      </w:r>
+    </w:p>
+    <w:p>
+      <w:pPr>
+        <w:rPr/>
+      </w:pPr>
+      <w:r>
+        <w:rPr>
+          <w:rtl w:val="0"/>
+        </w:rPr>
+      </w:r>
+    </w:p>
+    <w:p>
+      <w:pPr>
+        <w:rPr/>
+      </w:pPr>
+      <w:r>
+        <w:rPr>
+          <w:rtl w:val="0"/>
+        </w:rPr>
+      </w:r>
+    </w:p>
+    <w:p>
+      <w:pPr>
+        <w:rPr/>
+      </w:pPr>
+      <w:r>
+        <w:rPr>
+          <w:rtl w:val="0"/>
+        </w:rPr>
+      </w:r>
+    </w:p>
+    <w:p>
+      <w:pPr>
+        <w:rPr/>
+      </w:pPr>
+      <w:r>
+        <w:rPr>
+          <w:rtl w:val="0"/>
+        </w:rPr>
+      </w:r>
+    </w:p>
+    <w:p>
+      <w:pPr>
+        <w:rPr/>
+      </w:pPr>
+      <w:r>
+        <w:rPr>
+          <w:rtl w:val="0"/>
+        </w:rPr>
+      </w:r>
+    </w:p>
+    <w:p>
+      <w:pPr>
+        <w:rPr/>
+      </w:pPr>
+      <w:r>
+        <w:rPr>
+          <w:rtl w:val="0"/>
+        </w:rPr>
+      </w:r>
+    </w:p>
+    <w:p>
+      <w:pPr>
+        <w:pStyle w:val="Heading1"/>
+        <w:rPr/>
+      </w:pPr>
+      <w:bookmarkStart w:colFirst="0" w:colLast="0" w:name="_f56pouxhyfy8" w:id="1"/>
+      <w:bookmarkEnd w:id="1"/>
+      <w:r>
+        <w:rPr>
+          <w:rtl w:val="0"/>
+        </w:rPr>
+        <w:t xml:space="preserve">Part one</w:t>
+      </w:r>
+    </w:p>
+    <w:p>
+      <w:pPr>
+        <w:rPr/>
+      </w:pPr>
+      <w:r>
+        <w:rPr>
+          <w:rtl w:val="0"/>
+        </w:rPr>
+      </w:r>
+    </w:p>
+    <w:p>
+      <w:pPr>
+        <w:rPr/>
+      </w:pPr>
+      <w:r>
+        <w:rPr>
+          <w:rtl w:val="0"/>
+        </w:rPr>
+        <w:t xml:space="preserve">A coil will become magnetised. The number of coils is measured in Henrys.</w:t>
+      </w:r>
+    </w:p>
+    <w:p>
+      <w:pPr>
+        <w:rPr/>
+      </w:pPr>
+      <w:r>
+        <w:rPr>
+          <w:rtl w:val="0"/>
+        </w:rPr>
+        <w:t xml:space="preserve">This calculation to determine how much resistance is in the coil.</w:t>
+      </w:r>
+    </w:p>
+    <w:p>
+      <w:pPr>
+        <w:rPr/>
+      </w:pPr>
+      <w:r>
+        <w:rPr>
+          <w:rtl w:val="0"/>
+        </w:rPr>
+      </w:r>
+    </w:p>
+    <w:p>
+      <w:pPr>
+        <w:rPr/>
+      </w:pPr>
+      <w:r>
+        <w:rPr>
+          <w:rtl w:val="0"/>
+        </w:rPr>
+        <w:t xml:space="preserve">XL = 2πFL</w:t>
       </w:r>
     </w:p>
     <w:p>

</xml_diff>

<commit_message>
Added lesson 4 write-ups
</commit_message>
<xml_diff>
--- a/Electrical/Level 3 - 2365/4 - Lesson/Write-Up/4 -Lesson.docx
+++ b/Electrical/Level 3 - 2365/4 - Lesson/Write-Up/4 -Lesson.docx
@@ -50,6 +50,552 @@
         </w:rPr>
       </w:r>
     </w:p>
+    <w:sdt>
+      <w:sdtPr>
+        <w:id w:val="1467566476"/>
+        <w:docPartObj>
+          <w:docPartGallery w:val="Table of Contents"/>
+          <w:docPartUnique w:val="1"/>
+        </w:docPartObj>
+      </w:sdtPr>
+      <w:sdtContent>
+        <w:p>
+          <w:pPr>
+            <w:widowControl w:val="0"/>
+            <w:tabs>
+              <w:tab w:val="right" w:leader="none" w:pos="12000"/>
+            </w:tabs>
+            <w:spacing w:before="60" w:line="240" w:lineRule="auto"/>
+            <w:rPr>
+              <w:b w:val="1"/>
+              <w:bCs w:val="1"/>
+              <w:color w:val="000000"/>
+              <w:u w:val="none"/>
+            </w:rPr>
+          </w:pPr>
+          <w:r>
+            <w:fldChar w:fldCharType="begin"/>
+            <w:instrText xml:space="preserve"> TOC \h \u \z \t "Heading 1,1,Heading 2,2,Heading 3,3,Heading 4,4,Heading 5,5,Heading 6,6,"</w:instrText>
+            <w:fldChar w:fldCharType="separate"/>
+          </w:r>
+          <w:hyperlink w:anchor="_ljvgcepi0kh">
+            <w:r>
+              <w:rPr>
+                <w:rFonts w:ascii="Arial" w:cs="Arial" w:eastAsia="Arial" w:hAnsi="Arial"/>
+                <w:b w:val="1"/>
+                <w:bCs w:val="1"/>
+                <w:i w:val="0"/>
+                <w:iCs w:val="0"/>
+                <w:smallCaps w:val="0"/>
+                <w:strike w:val="0"/>
+                <w:color w:val="000000"/>
+                <w:sz w:val="22"/>
+                <w:szCs w:val="22"/>
+                <w:u w:val="none"/>
+                <w:shd w:fill="auto" w:val="clear"/>
+                <w:vertAlign w:val="baseline"/>
+                <w:rtl w:val="0"/>
+              </w:rPr>
+              <w:t xml:space="preserve">The Breakdown of the resistances</w:t>
+              <w:tab/>
+              <w:t xml:space="preserve">5</w:t>
+            </w:r>
+          </w:hyperlink>
+          <w:r>
+            <w:rPr>
+              <w:rtl w:val="0"/>
+            </w:rPr>
+          </w:r>
+        </w:p>
+        <w:p>
+          <w:pPr>
+            <w:widowControl w:val="0"/>
+            <w:tabs>
+              <w:tab w:val="right" w:leader="none" w:pos="12000"/>
+            </w:tabs>
+            <w:spacing w:before="60" w:line="240" w:lineRule="auto"/>
+            <w:rPr>
+              <w:b w:val="1"/>
+              <w:bCs w:val="1"/>
+              <w:color w:val="000000"/>
+              <w:u w:val="none"/>
+            </w:rPr>
+          </w:pPr>
+          <w:hyperlink w:anchor="_ob0s65x9ssg0">
+            <w:r>
+              <w:rPr>
+                <w:rFonts w:ascii="Arial" w:cs="Arial" w:eastAsia="Arial" w:hAnsi="Arial"/>
+                <w:b w:val="1"/>
+                <w:bCs w:val="1"/>
+                <w:i w:val="0"/>
+                <w:iCs w:val="0"/>
+                <w:smallCaps w:val="0"/>
+                <w:strike w:val="0"/>
+                <w:color w:val="000000"/>
+                <w:sz w:val="22"/>
+                <w:szCs w:val="22"/>
+                <w:u w:val="none"/>
+                <w:shd w:fill="auto" w:val="clear"/>
+                <w:vertAlign w:val="baseline"/>
+                <w:rtl w:val="0"/>
+              </w:rPr>
+              <w:t xml:space="preserve">Part one</w:t>
+              <w:tab/>
+              <w:t xml:space="preserve">8</w:t>
+            </w:r>
+          </w:hyperlink>
+          <w:r>
+            <w:rPr>
+              <w:rtl w:val="0"/>
+            </w:rPr>
+          </w:r>
+        </w:p>
+        <w:p>
+          <w:pPr>
+            <w:widowControl w:val="0"/>
+            <w:tabs>
+              <w:tab w:val="right" w:leader="none" w:pos="12000"/>
+            </w:tabs>
+            <w:spacing w:before="60" w:line="240" w:lineRule="auto"/>
+            <w:rPr>
+              <w:b w:val="1"/>
+              <w:bCs w:val="1"/>
+              <w:color w:val="000000"/>
+              <w:u w:val="none"/>
+            </w:rPr>
+          </w:pPr>
+          <w:hyperlink w:anchor="_ukpa1bceuxog">
+            <w:r>
+              <w:rPr>
+                <w:rFonts w:ascii="Arial" w:cs="Arial" w:eastAsia="Arial" w:hAnsi="Arial"/>
+                <w:b w:val="1"/>
+                <w:bCs w:val="1"/>
+                <w:i w:val="0"/>
+                <w:iCs w:val="0"/>
+                <w:smallCaps w:val="0"/>
+                <w:strike w:val="0"/>
+                <w:color w:val="000000"/>
+                <w:sz w:val="22"/>
+                <w:szCs w:val="22"/>
+                <w:u w:val="none"/>
+                <w:shd w:fill="auto" w:val="clear"/>
+                <w:vertAlign w:val="baseline"/>
+                <w:rtl w:val="0"/>
+              </w:rPr>
+              <w:t xml:space="preserve">End of Part one</w:t>
+              <w:tab/>
+              <w:t xml:space="preserve">10</w:t>
+            </w:r>
+          </w:hyperlink>
+          <w:r>
+            <w:rPr>
+              <w:rtl w:val="0"/>
+            </w:rPr>
+          </w:r>
+        </w:p>
+        <w:p>
+          <w:pPr>
+            <w:widowControl w:val="0"/>
+            <w:tabs>
+              <w:tab w:val="right" w:leader="none" w:pos="12000"/>
+            </w:tabs>
+            <w:spacing w:before="60" w:line="240" w:lineRule="auto"/>
+            <w:rPr>
+              <w:b w:val="1"/>
+              <w:bCs w:val="1"/>
+              <w:color w:val="000000"/>
+              <w:u w:val="none"/>
+            </w:rPr>
+          </w:pPr>
+          <w:hyperlink w:anchor="_xy03yqpvi3bm">
+            <w:r>
+              <w:rPr>
+                <w:rFonts w:ascii="Arial" w:cs="Arial" w:eastAsia="Arial" w:hAnsi="Arial"/>
+                <w:b w:val="1"/>
+                <w:bCs w:val="1"/>
+                <w:i w:val="0"/>
+                <w:iCs w:val="0"/>
+                <w:smallCaps w:val="0"/>
+                <w:strike w:val="0"/>
+                <w:color w:val="000000"/>
+                <w:sz w:val="22"/>
+                <w:szCs w:val="22"/>
+                <w:u w:val="none"/>
+                <w:shd w:fill="auto" w:val="clear"/>
+                <w:vertAlign w:val="baseline"/>
+                <w:rtl w:val="0"/>
+              </w:rPr>
+              <w:t xml:space="preserve">Worksheet 2 - WS2</w:t>
+              <w:tab/>
+              <w:t xml:space="preserve">11</w:t>
+            </w:r>
+          </w:hyperlink>
+          <w:r>
+            <w:rPr>
+              <w:rtl w:val="0"/>
+            </w:rPr>
+          </w:r>
+        </w:p>
+        <w:p>
+          <w:pPr>
+            <w:widowControl w:val="0"/>
+            <w:tabs>
+              <w:tab w:val="right" w:leader="none" w:pos="12000"/>
+            </w:tabs>
+            <w:spacing w:before="60" w:line="240" w:lineRule="auto"/>
+            <w:rPr>
+              <w:b w:val="1"/>
+              <w:bCs w:val="1"/>
+              <w:color w:val="000000"/>
+              <w:u w:val="none"/>
+            </w:rPr>
+          </w:pPr>
+          <w:hyperlink w:anchor="_q0pclepwg6m5">
+            <w:r>
+              <w:rPr>
+                <w:rFonts w:ascii="Arial" w:cs="Arial" w:eastAsia="Arial" w:hAnsi="Arial"/>
+                <w:b w:val="1"/>
+                <w:bCs w:val="1"/>
+                <w:i w:val="0"/>
+                <w:iCs w:val="0"/>
+                <w:smallCaps w:val="0"/>
+                <w:strike w:val="0"/>
+                <w:color w:val="000000"/>
+                <w:sz w:val="22"/>
+                <w:szCs w:val="22"/>
+                <w:u w:val="none"/>
+                <w:shd w:fill="auto" w:val="clear"/>
+                <w:vertAlign w:val="baseline"/>
+                <w:rtl w:val="0"/>
+              </w:rPr>
+              <w:t xml:space="preserve">WS2 Question 1</w:t>
+              <w:tab/>
+              <w:t xml:space="preserve">11</w:t>
+            </w:r>
+          </w:hyperlink>
+          <w:r>
+            <w:rPr>
+              <w:rtl w:val="0"/>
+            </w:rPr>
+          </w:r>
+        </w:p>
+        <w:p>
+          <w:pPr>
+            <w:widowControl w:val="0"/>
+            <w:tabs>
+              <w:tab w:val="right" w:leader="none" w:pos="12000"/>
+            </w:tabs>
+            <w:spacing w:before="60" w:line="240" w:lineRule="auto"/>
+            <w:rPr>
+              <w:b w:val="1"/>
+              <w:bCs w:val="1"/>
+              <w:color w:val="000000"/>
+              <w:u w:val="none"/>
+            </w:rPr>
+          </w:pPr>
+          <w:hyperlink w:anchor="_qys0xi8muocf">
+            <w:r>
+              <w:rPr>
+                <w:rFonts w:ascii="Arial" w:cs="Arial" w:eastAsia="Arial" w:hAnsi="Arial"/>
+                <w:b w:val="1"/>
+                <w:bCs w:val="1"/>
+                <w:i w:val="0"/>
+                <w:iCs w:val="0"/>
+                <w:smallCaps w:val="0"/>
+                <w:strike w:val="0"/>
+                <w:color w:val="000000"/>
+                <w:sz w:val="22"/>
+                <w:szCs w:val="22"/>
+                <w:u w:val="none"/>
+                <w:shd w:fill="auto" w:val="clear"/>
+                <w:vertAlign w:val="baseline"/>
+                <w:rtl w:val="0"/>
+              </w:rPr>
+              <w:t xml:space="preserve">WS2 Question 2</w:t>
+              <w:tab/>
+              <w:t xml:space="preserve">12</w:t>
+            </w:r>
+          </w:hyperlink>
+          <w:r>
+            <w:rPr>
+              <w:rtl w:val="0"/>
+            </w:rPr>
+          </w:r>
+        </w:p>
+        <w:p>
+          <w:pPr>
+            <w:widowControl w:val="0"/>
+            <w:tabs>
+              <w:tab w:val="right" w:leader="none" w:pos="12000"/>
+            </w:tabs>
+            <w:spacing w:before="60" w:line="240" w:lineRule="auto"/>
+            <w:rPr>
+              <w:b w:val="1"/>
+              <w:bCs w:val="1"/>
+              <w:color w:val="000000"/>
+              <w:u w:val="none"/>
+            </w:rPr>
+          </w:pPr>
+          <w:hyperlink w:anchor="_98sjaa8wu1yr">
+            <w:r>
+              <w:rPr>
+                <w:rFonts w:ascii="Arial" w:cs="Arial" w:eastAsia="Arial" w:hAnsi="Arial"/>
+                <w:b w:val="1"/>
+                <w:bCs w:val="1"/>
+                <w:i w:val="0"/>
+                <w:iCs w:val="0"/>
+                <w:smallCaps w:val="0"/>
+                <w:strike w:val="0"/>
+                <w:color w:val="000000"/>
+                <w:sz w:val="22"/>
+                <w:szCs w:val="22"/>
+                <w:u w:val="none"/>
+                <w:shd w:fill="auto" w:val="clear"/>
+                <w:vertAlign w:val="baseline"/>
+                <w:rtl w:val="0"/>
+              </w:rPr>
+              <w:t xml:space="preserve">WS2 Question 3</w:t>
+              <w:tab/>
+              <w:t xml:space="preserve">13</w:t>
+            </w:r>
+          </w:hyperlink>
+          <w:r>
+            <w:rPr>
+              <w:rtl w:val="0"/>
+            </w:rPr>
+          </w:r>
+        </w:p>
+        <w:p>
+          <w:pPr>
+            <w:widowControl w:val="0"/>
+            <w:tabs>
+              <w:tab w:val="right" w:leader="none" w:pos="12000"/>
+            </w:tabs>
+            <w:spacing w:before="60" w:line="240" w:lineRule="auto"/>
+            <w:rPr>
+              <w:b w:val="1"/>
+              <w:bCs w:val="1"/>
+              <w:color w:val="000000"/>
+              <w:u w:val="none"/>
+            </w:rPr>
+          </w:pPr>
+          <w:hyperlink w:anchor="_2h85y2fmbc5h">
+            <w:r>
+              <w:rPr>
+                <w:rFonts w:ascii="Arial" w:cs="Arial" w:eastAsia="Arial" w:hAnsi="Arial"/>
+                <w:b w:val="1"/>
+                <w:bCs w:val="1"/>
+                <w:i w:val="0"/>
+                <w:iCs w:val="0"/>
+                <w:smallCaps w:val="0"/>
+                <w:strike w:val="0"/>
+                <w:color w:val="000000"/>
+                <w:sz w:val="22"/>
+                <w:szCs w:val="22"/>
+                <w:u w:val="none"/>
+                <w:shd w:fill="auto" w:val="clear"/>
+                <w:vertAlign w:val="baseline"/>
+                <w:rtl w:val="0"/>
+              </w:rPr>
+              <w:t xml:space="preserve">WS2 Question 4</w:t>
+              <w:tab/>
+              <w:t xml:space="preserve">15</w:t>
+            </w:r>
+          </w:hyperlink>
+          <w:r>
+            <w:rPr>
+              <w:rtl w:val="0"/>
+            </w:rPr>
+          </w:r>
+        </w:p>
+        <w:p>
+          <w:pPr>
+            <w:widowControl w:val="0"/>
+            <w:tabs>
+              <w:tab w:val="right" w:leader="none" w:pos="12000"/>
+            </w:tabs>
+            <w:spacing w:before="60" w:line="240" w:lineRule="auto"/>
+            <w:rPr>
+              <w:b w:val="1"/>
+              <w:bCs w:val="1"/>
+              <w:color w:val="000000"/>
+              <w:u w:val="none"/>
+            </w:rPr>
+          </w:pPr>
+          <w:hyperlink w:anchor="_mhoamdn5fds1">
+            <w:r>
+              <w:rPr>
+                <w:rFonts w:ascii="Arial" w:cs="Arial" w:eastAsia="Arial" w:hAnsi="Arial"/>
+                <w:b w:val="1"/>
+                <w:bCs w:val="1"/>
+                <w:i w:val="0"/>
+                <w:iCs w:val="0"/>
+                <w:smallCaps w:val="0"/>
+                <w:strike w:val="0"/>
+                <w:color w:val="000000"/>
+                <w:sz w:val="22"/>
+                <w:szCs w:val="22"/>
+                <w:u w:val="none"/>
+                <w:shd w:fill="auto" w:val="clear"/>
+                <w:vertAlign w:val="baseline"/>
+                <w:rtl w:val="0"/>
+              </w:rPr>
+              <w:t xml:space="preserve">WS2 Question 5</w:t>
+              <w:tab/>
+              <w:t xml:space="preserve">18</w:t>
+            </w:r>
+          </w:hyperlink>
+          <w:r>
+            <w:rPr>
+              <w:rtl w:val="0"/>
+            </w:rPr>
+          </w:r>
+        </w:p>
+        <w:p>
+          <w:pPr>
+            <w:widowControl w:val="0"/>
+            <w:tabs>
+              <w:tab w:val="right" w:leader="none" w:pos="12000"/>
+            </w:tabs>
+            <w:spacing w:before="60" w:line="240" w:lineRule="auto"/>
+            <w:rPr>
+              <w:b w:val="1"/>
+              <w:bCs w:val="1"/>
+              <w:color w:val="000000"/>
+              <w:u w:val="none"/>
+            </w:rPr>
+          </w:pPr>
+          <w:hyperlink w:anchor="_wk6qt0jq6xsf">
+            <w:r>
+              <w:rPr>
+                <w:rFonts w:ascii="Arial" w:cs="Arial" w:eastAsia="Arial" w:hAnsi="Arial"/>
+                <w:b w:val="1"/>
+                <w:bCs w:val="1"/>
+                <w:i w:val="0"/>
+                <w:iCs w:val="0"/>
+                <w:smallCaps w:val="0"/>
+                <w:strike w:val="0"/>
+                <w:color w:val="000000"/>
+                <w:sz w:val="22"/>
+                <w:szCs w:val="22"/>
+                <w:u w:val="none"/>
+                <w:shd w:fill="auto" w:val="clear"/>
+                <w:vertAlign w:val="baseline"/>
+                <w:rtl w:val="0"/>
+              </w:rPr>
+              <w:t xml:space="preserve">WS2 Question 6</w:t>
+              <w:tab/>
+              <w:t xml:space="preserve">21</w:t>
+            </w:r>
+          </w:hyperlink>
+          <w:r>
+            <w:rPr>
+              <w:rtl w:val="0"/>
+            </w:rPr>
+          </w:r>
+        </w:p>
+        <w:p>
+          <w:pPr>
+            <w:widowControl w:val="0"/>
+            <w:tabs>
+              <w:tab w:val="right" w:leader="none" w:pos="12000"/>
+            </w:tabs>
+            <w:spacing w:before="60" w:line="240" w:lineRule="auto"/>
+            <w:rPr>
+              <w:b w:val="1"/>
+              <w:bCs w:val="1"/>
+              <w:color w:val="000000"/>
+              <w:u w:val="none"/>
+            </w:rPr>
+          </w:pPr>
+          <w:hyperlink w:anchor="_yht26ytrtpc8">
+            <w:r>
+              <w:rPr>
+                <w:rFonts w:ascii="Arial" w:cs="Arial" w:eastAsia="Arial" w:hAnsi="Arial"/>
+                <w:b w:val="1"/>
+                <w:bCs w:val="1"/>
+                <w:i w:val="0"/>
+                <w:iCs w:val="0"/>
+                <w:smallCaps w:val="0"/>
+                <w:strike w:val="0"/>
+                <w:color w:val="000000"/>
+                <w:sz w:val="22"/>
+                <w:szCs w:val="22"/>
+                <w:u w:val="none"/>
+                <w:shd w:fill="auto" w:val="clear"/>
+                <w:vertAlign w:val="baseline"/>
+                <w:rtl w:val="0"/>
+              </w:rPr>
+              <w:t xml:space="preserve">Worksheet 3 - WS3</w:t>
+              <w:tab/>
+              <w:t xml:space="preserve">24</w:t>
+            </w:r>
+          </w:hyperlink>
+          <w:r>
+            <w:rPr>
+              <w:rtl w:val="0"/>
+            </w:rPr>
+          </w:r>
+        </w:p>
+        <w:p>
+          <w:pPr>
+            <w:widowControl w:val="0"/>
+            <w:tabs>
+              <w:tab w:val="right" w:leader="none" w:pos="12000"/>
+            </w:tabs>
+            <w:spacing w:before="60" w:line="240" w:lineRule="auto"/>
+            <w:rPr>
+              <w:b w:val="1"/>
+              <w:bCs w:val="1"/>
+              <w:color w:val="000000"/>
+              <w:u w:val="none"/>
+            </w:rPr>
+          </w:pPr>
+          <w:hyperlink w:anchor="_bunpl8g4k3yy">
+            <w:r>
+              <w:rPr>
+                <w:b w:val="1"/>
+                <w:bCs w:val="1"/>
+                <w:color w:val="000000"/>
+                <w:u w:val="none"/>
+                <w:rtl w:val="0"/>
+              </w:rPr>
+              <w:t xml:space="preserve">WS3 - Question 1</w:t>
+              <w:tab/>
+              <w:t xml:space="preserve">24</w:t>
+            </w:r>
+          </w:hyperlink>
+          <w:r>
+            <w:rPr>
+              <w:rtl w:val="0"/>
+            </w:rPr>
+          </w:r>
+          <w:r>
+            <w:fldChar w:fldCharType="end"/>
+          </w:r>
+        </w:p>
+      </w:sdtContent>
+    </w:sdt>
+    <w:p>
+      <w:pPr>
+        <w:rPr/>
+      </w:pPr>
+      <w:r>
+        <w:rPr>
+          <w:rtl w:val="0"/>
+        </w:rPr>
+      </w:r>
+    </w:p>
+    <w:p>
+      <w:pPr>
+        <w:rPr/>
+      </w:pPr>
+      <w:r>
+        <w:rPr>
+          <w:rtl w:val="0"/>
+        </w:rPr>
+      </w:r>
+    </w:p>
     <w:p>
       <w:pPr>
         <w:rPr/>
@@ -165,12 +711,12 @@
           <wp:inline distB="114300" distT="114300" distL="114300" distR="114300">
             <wp:extent cx="3548063" cy="2547811"/>
             <wp:effectExtent b="50800" l="50800" r="50800" t="50800"/>
-            <wp:docPr id="24" name="image25.png"/>
+            <wp:docPr id="24" name="image18.png"/>
             <a:graphic>
               <a:graphicData uri="http://schemas.openxmlformats.org/drawingml/2006/picture">
                 <pic:pic>
                   <pic:nvPicPr>
-                    <pic:cNvPr id="0" name="image25.png"/>
+                    <pic:cNvPr id="0" name="image18.png"/>
                     <pic:cNvPicPr preferRelativeResize="0"/>
                   </pic:nvPicPr>
                   <pic:blipFill>
@@ -298,12 +844,12 @@
           <wp:inline distB="114300" distT="114300" distL="114300" distR="114300">
             <wp:extent cx="4505325" cy="3714750"/>
             <wp:effectExtent b="25400" l="25400" r="25400" t="25400"/>
-            <wp:docPr id="27" name="image23.png"/>
+            <wp:docPr id="27" name="image17.png"/>
             <a:graphic>
               <a:graphicData uri="http://schemas.openxmlformats.org/drawingml/2006/picture">
                 <pic:pic>
                   <pic:nvPicPr>
-                    <pic:cNvPr id="0" name="image23.png"/>
+                    <pic:cNvPr id="0" name="image17.png"/>
                     <pic:cNvPicPr preferRelativeResize="0"/>
                   </pic:nvPicPr>
                   <pic:blipFill>
@@ -411,12 +957,12 @@
           <wp:inline distB="114300" distT="114300" distL="114300" distR="114300">
             <wp:extent cx="4810125" cy="3924300"/>
             <wp:effectExtent b="25400" l="25400" r="25400" t="25400"/>
-            <wp:docPr id="26" name="image21.png"/>
+            <wp:docPr id="26" name="image23.png"/>
             <a:graphic>
               <a:graphicData uri="http://schemas.openxmlformats.org/drawingml/2006/picture">
                 <pic:pic>
                   <pic:nvPicPr>
-                    <pic:cNvPr id="0" name="image21.png"/>
+                    <pic:cNvPr id="0" name="image23.png"/>
                     <pic:cNvPicPr preferRelativeResize="0"/>
                   </pic:nvPicPr>
                   <pic:blipFill>
@@ -611,12 +1157,12 @@
           <wp:inline distB="114300" distT="114300" distL="114300" distR="114300">
             <wp:extent cx="5534025" cy="3048000"/>
             <wp:effectExtent b="25400" l="25400" r="25400" t="25400"/>
-            <wp:docPr id="30" name="image34.png"/>
+            <wp:docPr id="30" name="image22.png"/>
             <a:graphic>
               <a:graphicData uri="http://schemas.openxmlformats.org/drawingml/2006/picture">
                 <pic:pic>
                   <pic:nvPicPr>
-                    <pic:cNvPr id="0" name="image34.png"/>
+                    <pic:cNvPr id="0" name="image22.png"/>
                     <pic:cNvPicPr preferRelativeResize="0"/>
                   </pic:nvPicPr>
                   <pic:blipFill>
@@ -796,12 +1342,12 @@
           <wp:inline distB="114300" distT="114300" distL="114300" distR="114300">
             <wp:extent cx="4886325" cy="3752850"/>
             <wp:effectExtent b="25400" l="25400" r="25400" t="25400"/>
-            <wp:docPr id="28" name="image37.png"/>
+            <wp:docPr id="28" name="image30.png"/>
             <a:graphic>
               <a:graphicData uri="http://schemas.openxmlformats.org/drawingml/2006/picture">
                 <pic:pic>
                   <pic:nvPicPr>
-                    <pic:cNvPr id="0" name="image37.png"/>
+                    <pic:cNvPr id="0" name="image30.png"/>
                     <pic:cNvPicPr preferRelativeResize="0"/>
                   </pic:nvPicPr>
                   <pic:blipFill>
@@ -1046,12 +1592,12 @@
           <wp:inline distB="114300" distT="114300" distL="114300" distR="114300">
             <wp:extent cx="5731200" cy="2413000"/>
             <wp:effectExtent b="25400" l="25400" r="25400" t="25400"/>
-            <wp:docPr id="32" name="image35.png"/>
+            <wp:docPr id="32" name="image24.png"/>
             <a:graphic>
               <a:graphicData uri="http://schemas.openxmlformats.org/drawingml/2006/picture">
                 <pic:pic>
                   <pic:nvPicPr>
-                    <pic:cNvPr id="0" name="image35.png"/>
+                    <pic:cNvPr id="0" name="image24.png"/>
                     <pic:cNvPicPr preferRelativeResize="0"/>
                   </pic:nvPicPr>
                   <pic:blipFill>
@@ -1156,12 +1702,12 @@
           <wp:inline distB="114300" distT="114300" distL="114300" distR="114300">
             <wp:extent cx="5019675" cy="3819525"/>
             <wp:effectExtent b="25400" l="25400" r="25400" t="25400"/>
-            <wp:docPr id="31" name="image33.png"/>
+            <wp:docPr id="31" name="image34.png"/>
             <a:graphic>
               <a:graphicData uri="http://schemas.openxmlformats.org/drawingml/2006/picture">
                 <pic:pic>
                   <pic:nvPicPr>
-                    <pic:cNvPr id="0" name="image33.png"/>
+                    <pic:cNvPr id="0" name="image34.png"/>
                     <pic:cNvPicPr preferRelativeResize="0"/>
                   </pic:nvPicPr>
                   <pic:blipFill>
@@ -1286,12 +1832,12 @@
           <wp:inline distB="114300" distT="114300" distL="114300" distR="114300">
             <wp:extent cx="5731200" cy="2362200"/>
             <wp:effectExtent b="25400" l="25400" r="25400" t="25400"/>
-            <wp:docPr id="35" name="image40.png"/>
+            <wp:docPr id="35" name="image35.png"/>
             <a:graphic>
               <a:graphicData uri="http://schemas.openxmlformats.org/drawingml/2006/picture">
                 <pic:pic>
                   <pic:nvPicPr>
-                    <pic:cNvPr id="0" name="image40.png"/>
+                    <pic:cNvPr id="0" name="image35.png"/>
                     <pic:cNvPicPr preferRelativeResize="0"/>
                   </pic:nvPicPr>
                   <pic:blipFill>
@@ -1372,12 +1918,12 @@
           <wp:inline distB="114300" distT="114300" distL="114300" distR="114300">
             <wp:extent cx="5731200" cy="2463800"/>
             <wp:effectExtent b="25400" l="25400" r="25400" t="25400"/>
-            <wp:docPr id="34" name="image24.png"/>
+            <wp:docPr id="34" name="image36.png"/>
             <a:graphic>
               <a:graphicData uri="http://schemas.openxmlformats.org/drawingml/2006/picture">
                 <pic:pic>
                   <pic:nvPicPr>
-                    <pic:cNvPr id="0" name="image24.png"/>
+                    <pic:cNvPr id="0" name="image36.png"/>
                     <pic:cNvPicPr preferRelativeResize="0"/>
                   </pic:nvPicPr>
                   <pic:blipFill>
@@ -2039,12 +2585,12 @@
           <wp:inline distB="114300" distT="114300" distL="114300" distR="114300">
             <wp:extent cx="4103608" cy="3124338"/>
             <wp:effectExtent b="25400" l="25400" r="25400" t="25400"/>
-            <wp:docPr id="29" name="image32.png"/>
+            <wp:docPr id="29" name="image27.png"/>
             <a:graphic>
               <a:graphicData uri="http://schemas.openxmlformats.org/drawingml/2006/picture">
                 <pic:pic>
                   <pic:nvPicPr>
-                    <pic:cNvPr id="0" name="image32.png"/>
+                    <pic:cNvPr id="0" name="image27.png"/>
                     <pic:cNvPicPr preferRelativeResize="0"/>
                   </pic:nvPicPr>
                   <pic:blipFill>
@@ -2209,12 +2755,12 @@
           <wp:inline distB="114300" distT="114300" distL="114300" distR="114300">
             <wp:extent cx="3833813" cy="4043972"/>
             <wp:effectExtent b="25400" l="25400" r="25400" t="25400"/>
-            <wp:docPr id="4" name="image5.png"/>
+            <wp:docPr id="4" name="image20.png"/>
             <a:graphic>
               <a:graphicData uri="http://schemas.openxmlformats.org/drawingml/2006/picture">
                 <pic:pic>
                   <pic:nvPicPr>
-                    <pic:cNvPr id="0" name="image5.png"/>
+                    <pic:cNvPr id="0" name="image20.png"/>
                     <pic:cNvPicPr preferRelativeResize="0"/>
                   </pic:nvPicPr>
                   <pic:blipFill>
@@ -2299,12 +2845,12 @@
           <wp:inline distB="114300" distT="114300" distL="114300" distR="114300">
             <wp:extent cx="4875053" cy="1757287"/>
             <wp:effectExtent b="25400" l="25400" r="25400" t="25400"/>
-            <wp:docPr id="12" name="image39.png"/>
+            <wp:docPr id="12" name="image11.png"/>
             <a:graphic>
               <a:graphicData uri="http://schemas.openxmlformats.org/drawingml/2006/picture">
                 <pic:pic>
                   <pic:nvPicPr>
-                    <pic:cNvPr id="0" name="image39.png"/>
+                    <pic:cNvPr id="0" name="image11.png"/>
                     <pic:cNvPicPr preferRelativeResize="0"/>
                   </pic:nvPicPr>
                   <pic:blipFill>
@@ -2502,12 +3048,12 @@
           <wp:inline distB="114300" distT="114300" distL="114300" distR="114300">
             <wp:extent cx="5072063" cy="2224293"/>
             <wp:effectExtent b="25400" l="25400" r="25400" t="25400"/>
-            <wp:docPr id="25" name="image22.png"/>
+            <wp:docPr id="25" name="image25.png"/>
             <a:graphic>
               <a:graphicData uri="http://schemas.openxmlformats.org/drawingml/2006/picture">
                 <pic:pic>
                   <pic:nvPicPr>
-                    <pic:cNvPr id="0" name="image22.png"/>
+                    <pic:cNvPr id="0" name="image25.png"/>
                     <pic:cNvPicPr preferRelativeResize="0"/>
                   </pic:nvPicPr>
                   <pic:blipFill>
@@ -3269,12 +3815,12 @@
           <wp:inline distB="114300" distT="114300" distL="114300" distR="114300">
             <wp:extent cx="2740625" cy="1833563"/>
             <wp:effectExtent b="25400" l="25400" r="25400" t="25400"/>
-            <wp:docPr id="1" name="image18.png"/>
+            <wp:docPr id="1" name="image10.png"/>
             <a:graphic>
               <a:graphicData uri="http://schemas.openxmlformats.org/drawingml/2006/picture">
                 <pic:pic>
                   <pic:nvPicPr>
-                    <pic:cNvPr id="0" name="image18.png"/>
+                    <pic:cNvPr id="0" name="image10.png"/>
                     <pic:cNvPicPr preferRelativeResize="0"/>
                   </pic:nvPicPr>
                   <pic:blipFill>
@@ -3465,12 +4011,12 @@
           <wp:inline distB="114300" distT="114300" distL="114300" distR="114300">
             <wp:extent cx="5976667" cy="2565149"/>
             <wp:effectExtent b="25400" l="25400" r="25400" t="25400"/>
-            <wp:docPr id="11" name="image11.jpg"/>
+            <wp:docPr id="11" name="image7.jpg"/>
             <a:graphic>
               <a:graphicData uri="http://schemas.openxmlformats.org/drawingml/2006/picture">
                 <pic:pic>
                   <pic:nvPicPr>
-                    <pic:cNvPr id="0" name="image11.jpg"/>
+                    <pic:cNvPr id="0" name="image7.jpg"/>
                     <pic:cNvPicPr preferRelativeResize="0"/>
                   </pic:nvPicPr>
                   <pic:blipFill>
@@ -4003,12 +4549,12 @@
           <wp:inline distB="114300" distT="114300" distL="114300" distR="114300">
             <wp:extent cx="5033963" cy="2918360"/>
             <wp:effectExtent b="25400" l="25400" r="25400" t="25400"/>
-            <wp:docPr id="22" name="image30.png"/>
+            <wp:docPr id="22" name="image38.png"/>
             <a:graphic>
               <a:graphicData uri="http://schemas.openxmlformats.org/drawingml/2006/picture">
                 <pic:pic>
                   <pic:nvPicPr>
-                    <pic:cNvPr id="0" name="image30.png"/>
+                    <pic:cNvPr id="0" name="image38.png"/>
                     <pic:cNvPicPr preferRelativeResize="0"/>
                   </pic:nvPicPr>
                   <pic:blipFill>
@@ -4233,12 +4779,12 @@
           <wp:inline distB="114300" distT="114300" distL="114300" distR="114300">
             <wp:extent cx="6443663" cy="2417449"/>
             <wp:effectExtent b="25400" l="25400" r="25400" t="25400"/>
-            <wp:docPr id="16" name="image15.jpg"/>
+            <wp:docPr id="16" name="image6.jpg"/>
             <a:graphic>
               <a:graphicData uri="http://schemas.openxmlformats.org/drawingml/2006/picture">
                 <pic:pic>
                   <pic:nvPicPr>
-                    <pic:cNvPr id="0" name="image15.jpg"/>
+                    <pic:cNvPr id="0" name="image6.jpg"/>
                     <pic:cNvPicPr preferRelativeResize="0"/>
                   </pic:nvPicPr>
                   <pic:blipFill>
@@ -4488,12 +5034,12 @@
           <wp:inline distB="114300" distT="114300" distL="114300" distR="114300">
             <wp:extent cx="2134415" cy="1470664"/>
             <wp:effectExtent b="25400" l="25400" r="25400" t="25400"/>
-            <wp:docPr id="18" name="image2.png"/>
+            <wp:docPr id="18" name="image16.png"/>
             <a:graphic>
               <a:graphicData uri="http://schemas.openxmlformats.org/drawingml/2006/picture">
                 <pic:pic>
                   <pic:nvPicPr>
-                    <pic:cNvPr id="0" name="image2.png"/>
+                    <pic:cNvPr id="0" name="image16.png"/>
                     <pic:cNvPicPr preferRelativeResize="0"/>
                   </pic:nvPicPr>
                   <pic:blipFill>
@@ -4557,12 +5103,12 @@
           <wp:inline distB="114300" distT="114300" distL="114300" distR="114300">
             <wp:extent cx="2266131" cy="1540211"/>
             <wp:effectExtent b="25400" l="25400" r="25400" t="25400"/>
-            <wp:docPr id="10" name="image12.png"/>
+            <wp:docPr id="10" name="image2.png"/>
             <a:graphic>
               <a:graphicData uri="http://schemas.openxmlformats.org/drawingml/2006/picture">
                 <pic:pic>
                   <pic:nvPicPr>
-                    <pic:cNvPr id="0" name="image12.png"/>
+                    <pic:cNvPr id="0" name="image2.png"/>
                     <pic:cNvPicPr preferRelativeResize="0"/>
                   </pic:nvPicPr>
                   <pic:blipFill>
@@ -4935,12 +5481,12 @@
           <wp:inline distB="114300" distT="114300" distL="114300" distR="114300">
             <wp:extent cx="3192416" cy="2072636"/>
             <wp:effectExtent b="25400" l="25400" r="25400" t="25400"/>
-            <wp:docPr id="23" name="image20.png"/>
+            <wp:docPr id="23" name="image39.png"/>
             <a:graphic>
               <a:graphicData uri="http://schemas.openxmlformats.org/drawingml/2006/picture">
                 <pic:pic>
                   <pic:nvPicPr>
-                    <pic:cNvPr id="0" name="image20.png"/>
+                    <pic:cNvPr id="0" name="image39.png"/>
                     <pic:cNvPicPr preferRelativeResize="0"/>
                   </pic:nvPicPr>
                   <pic:blipFill>
@@ -5125,12 +5671,12 @@
           <wp:inline distB="114300" distT="114300" distL="114300" distR="114300">
             <wp:extent cx="3214688" cy="2234322"/>
             <wp:effectExtent b="25400" l="25400" r="25400" t="25400"/>
-            <wp:docPr id="6" name="image1.png"/>
+            <wp:docPr id="6" name="image9.png"/>
             <a:graphic>
               <a:graphicData uri="http://schemas.openxmlformats.org/drawingml/2006/picture">
                 <pic:pic>
                   <pic:nvPicPr>
-                    <pic:cNvPr id="0" name="image1.png"/>
+                    <pic:cNvPr id="0" name="image9.png"/>
                     <pic:cNvPicPr preferRelativeResize="0"/>
                   </pic:nvPicPr>
                   <pic:blipFill>
@@ -5238,12 +5784,12 @@
           <wp:inline distB="114300" distT="114300" distL="114300" distR="114300">
             <wp:extent cx="3876675" cy="2495550"/>
             <wp:effectExtent b="25400" l="25400" r="25400" t="25400"/>
-            <wp:docPr id="3" name="image13.jpg"/>
+            <wp:docPr id="3" name="image3.jpg"/>
             <a:graphic>
               <a:graphicData uri="http://schemas.openxmlformats.org/drawingml/2006/picture">
                 <pic:pic>
                   <pic:nvPicPr>
-                    <pic:cNvPr id="0" name="image13.jpg"/>
+                    <pic:cNvPr id="0" name="image3.jpg"/>
                     <pic:cNvPicPr preferRelativeResize="0"/>
                   </pic:nvPicPr>
                   <pic:blipFill>
@@ -5477,12 +6023,12 @@
           <wp:inline distB="114300" distT="114300" distL="114300" distR="114300">
             <wp:extent cx="2890838" cy="2194539"/>
             <wp:effectExtent b="25400" l="25400" r="25400" t="25400"/>
-            <wp:docPr id="14" name="image4.png"/>
+            <wp:docPr id="14" name="image13.png"/>
             <a:graphic>
               <a:graphicData uri="http://schemas.openxmlformats.org/drawingml/2006/picture">
                 <pic:pic>
                   <pic:nvPicPr>
-                    <pic:cNvPr id="0" name="image4.png"/>
+                    <pic:cNvPr id="0" name="image13.png"/>
                     <pic:cNvPicPr preferRelativeResize="0"/>
                   </pic:nvPicPr>
                   <pic:blipFill>
@@ -5593,12 +6139,12 @@
           <wp:inline distB="114300" distT="114300" distL="114300" distR="114300">
             <wp:extent cx="3328988" cy="2545028"/>
             <wp:effectExtent b="25400" l="25400" r="25400" t="25400"/>
-            <wp:docPr id="17" name="image10.png"/>
+            <wp:docPr id="17" name="image8.png"/>
             <a:graphic>
               <a:graphicData uri="http://schemas.openxmlformats.org/drawingml/2006/picture">
                 <pic:pic>
                   <pic:nvPicPr>
-                    <pic:cNvPr id="0" name="image10.png"/>
+                    <pic:cNvPr id="0" name="image8.png"/>
                     <pic:cNvPicPr preferRelativeResize="0"/>
                   </pic:nvPicPr>
                   <pic:blipFill>
@@ -6027,12 +6573,12 @@
           <wp:inline distB="114300" distT="114300" distL="114300" distR="114300">
             <wp:extent cx="2695575" cy="857250"/>
             <wp:effectExtent b="25400" l="25400" r="25400" t="25400"/>
-            <wp:docPr id="8" name="image14.png"/>
+            <wp:docPr id="8" name="image4.png"/>
             <a:graphic>
               <a:graphicData uri="http://schemas.openxmlformats.org/drawingml/2006/picture">
                 <pic:pic>
                   <pic:nvPicPr>
-                    <pic:cNvPr id="0" name="image14.png"/>
+                    <pic:cNvPr id="0" name="image4.png"/>
                     <pic:cNvPicPr preferRelativeResize="0"/>
                   </pic:nvPicPr>
                   <pic:blipFill>
@@ -6139,12 +6685,12 @@
           <wp:inline distB="114300" distT="114300" distL="114300" distR="114300">
             <wp:extent cx="1981200" cy="876300"/>
             <wp:effectExtent b="25400" l="25400" r="25400" t="25400"/>
-            <wp:docPr id="13" name="image17.png"/>
+            <wp:docPr id="13" name="image19.png"/>
             <a:graphic>
               <a:graphicData uri="http://schemas.openxmlformats.org/drawingml/2006/picture">
                 <pic:pic>
                   <pic:nvPicPr>
-                    <pic:cNvPr id="0" name="image17.png"/>
+                    <pic:cNvPr id="0" name="image19.png"/>
                     <pic:cNvPicPr preferRelativeResize="0"/>
                   </pic:nvPicPr>
                   <pic:blipFill>
@@ -6271,6 +6817,12 @@
         <w:rPr>
           <w:rtl w:val="0"/>
         </w:rPr>
+        <w:t xml:space="preserve">WS2 </w:t>
+      </w:r>
+      <w:r>
+        <w:rPr>
+          <w:rtl w:val="0"/>
+        </w:rPr>
         <w:t xml:space="preserve">Question 5</w:t>
       </w:r>
     </w:p>
@@ -6303,12 +6855,12 @@
           <wp:inline distB="114300" distT="114300" distL="114300" distR="114300">
             <wp:extent cx="4400550" cy="2623375"/>
             <wp:effectExtent b="25400" l="25400" r="25400" t="25400"/>
-            <wp:docPr id="41" name="image36.jpg"/>
+            <wp:docPr id="41" name="image40.jpg"/>
             <a:graphic>
               <a:graphicData uri="http://schemas.openxmlformats.org/drawingml/2006/picture">
                 <pic:pic>
                   <pic:nvPicPr>
-                    <pic:cNvPr id="0" name="image36.jpg"/>
+                    <pic:cNvPr id="0" name="image40.jpg"/>
                     <pic:cNvPicPr preferRelativeResize="0"/>
                   </pic:nvPicPr>
                   <pic:blipFill>
@@ -6773,12 +7325,12 @@
           <wp:inline distB="114300" distT="114300" distL="114300" distR="114300">
             <wp:extent cx="3197554" cy="2043113"/>
             <wp:effectExtent b="25400" l="25400" r="25400" t="25400"/>
-            <wp:docPr id="39" name="image38.png"/>
+            <wp:docPr id="39" name="image29.png"/>
             <a:graphic>
               <a:graphicData uri="http://schemas.openxmlformats.org/drawingml/2006/picture">
                 <pic:pic>
                   <pic:nvPicPr>
-                    <pic:cNvPr id="0" name="image38.png"/>
+                    <pic:cNvPr id="0" name="image29.png"/>
                     <pic:cNvPicPr preferRelativeResize="0"/>
                   </pic:nvPicPr>
                   <pic:blipFill>
@@ -6875,12 +7427,12 @@
           <wp:inline distB="114300" distT="114300" distL="114300" distR="114300">
             <wp:extent cx="3393474" cy="2390088"/>
             <wp:effectExtent b="25400" l="25400" r="25400" t="25400"/>
-            <wp:docPr id="7" name="image6.png"/>
+            <wp:docPr id="7" name="image26.png"/>
             <a:graphic>
               <a:graphicData uri="http://schemas.openxmlformats.org/drawingml/2006/picture">
                 <pic:pic>
                   <pic:nvPicPr>
-                    <pic:cNvPr id="0" name="image6.png"/>
+                    <pic:cNvPr id="0" name="image26.png"/>
                     <pic:cNvPicPr preferRelativeResize="0"/>
                   </pic:nvPicPr>
                   <pic:blipFill>
@@ -7040,12 +7592,12 @@
           <wp:inline distB="114300" distT="114300" distL="114300" distR="114300">
             <wp:extent cx="2614057" cy="1801149"/>
             <wp:effectExtent b="25400" l="25400" r="25400" t="25400"/>
-            <wp:docPr id="5" name="image8.png"/>
+            <wp:docPr id="5" name="image21.png"/>
             <a:graphic>
               <a:graphicData uri="http://schemas.openxmlformats.org/drawingml/2006/picture">
                 <pic:pic>
                   <pic:nvPicPr>
-                    <pic:cNvPr id="0" name="image8.png"/>
+                    <pic:cNvPr id="0" name="image21.png"/>
                     <pic:cNvPicPr preferRelativeResize="0"/>
                   </pic:nvPicPr>
                   <pic:blipFill>
@@ -7138,12 +7690,12 @@
           <wp:inline distB="114300" distT="114300" distL="114300" distR="114300">
             <wp:extent cx="3590925" cy="857250"/>
             <wp:effectExtent b="25400" l="25400" r="25400" t="25400"/>
-            <wp:docPr id="9" name="image9.png"/>
+            <wp:docPr id="9" name="image1.png"/>
             <a:graphic>
               <a:graphicData uri="http://schemas.openxmlformats.org/drawingml/2006/picture">
                 <pic:pic>
                   <pic:nvPicPr>
-                    <pic:cNvPr id="0" name="image9.png"/>
+                    <pic:cNvPr id="0" name="image1.png"/>
                     <pic:cNvPicPr preferRelativeResize="0"/>
                   </pic:nvPicPr>
                   <pic:blipFill>
@@ -7236,12 +7788,12 @@
           <wp:inline distB="114300" distT="114300" distL="114300" distR="114300">
             <wp:extent cx="3333750" cy="723900"/>
             <wp:effectExtent b="25400" l="25400" r="25400" t="25400"/>
-            <wp:docPr id="38" name="image28.png"/>
+            <wp:docPr id="38" name="image37.png"/>
             <a:graphic>
               <a:graphicData uri="http://schemas.openxmlformats.org/drawingml/2006/picture">
                 <pic:pic>
                   <pic:nvPicPr>
-                    <pic:cNvPr id="0" name="image28.png"/>
+                    <pic:cNvPr id="0" name="image37.png"/>
                     <pic:cNvPicPr preferRelativeResize="0"/>
                   </pic:nvPicPr>
                   <pic:blipFill>
@@ -7360,12 +7912,12 @@
           <wp:inline distB="114300" distT="114300" distL="114300" distR="114300">
             <wp:extent cx="1609725" cy="714375"/>
             <wp:effectExtent b="25400" l="25400" r="25400" t="25400"/>
-            <wp:docPr id="2" name="image16.png"/>
+            <wp:docPr id="2" name="image5.png"/>
             <a:graphic>
               <a:graphicData uri="http://schemas.openxmlformats.org/drawingml/2006/picture">
                 <pic:pic>
                   <pic:nvPicPr>
-                    <pic:cNvPr id="0" name="image16.png"/>
+                    <pic:cNvPr id="0" name="image5.png"/>
                     <pic:cNvPicPr preferRelativeResize="0"/>
                   </pic:nvPicPr>
                   <pic:blipFill>
@@ -7442,12 +7994,12 @@
           <wp:inline distB="114300" distT="114300" distL="114300" distR="114300">
             <wp:extent cx="5731200" cy="2044700"/>
             <wp:effectExtent b="25400" l="25400" r="25400" t="25400"/>
-            <wp:docPr id="36" name="image26.png"/>
+            <wp:docPr id="36" name="image31.png"/>
             <a:graphic>
               <a:graphicData uri="http://schemas.openxmlformats.org/drawingml/2006/picture">
                 <pic:pic>
                   <pic:nvPicPr>
-                    <pic:cNvPr id="0" name="image26.png"/>
+                    <pic:cNvPr id="0" name="image31.png"/>
                     <pic:cNvPicPr preferRelativeResize="0"/>
                   </pic:nvPicPr>
                   <pic:blipFill>
@@ -7623,7 +8175,7 @@
         <w:rPr>
           <w:rtl w:val="0"/>
         </w:rPr>
-        <w:t xml:space="preserve">Question 6 </w:t>
+        <w:t xml:space="preserve">WS2 Question 6 </w:t>
       </w:r>
     </w:p>
     <w:p>
@@ -7636,12 +8188,12 @@
           <wp:inline distB="114300" distT="114300" distL="114300" distR="114300">
             <wp:extent cx="3674812" cy="2297776"/>
             <wp:effectExtent b="25400" l="25400" r="25400" t="25400"/>
-            <wp:docPr id="33" name="image27.jpg"/>
+            <wp:docPr id="33" name="image32.jpg"/>
             <a:graphic>
               <a:graphicData uri="http://schemas.openxmlformats.org/drawingml/2006/picture">
                 <pic:pic>
                   <pic:nvPicPr>
-                    <pic:cNvPr id="0" name="image27.jpg"/>
+                    <pic:cNvPr id="0" name="image32.jpg"/>
                     <pic:cNvPicPr preferRelativeResize="0"/>
                   </pic:nvPicPr>
                   <pic:blipFill>
@@ -7686,12 +8238,12 @@
           <wp:inline distB="114300" distT="114300" distL="114300" distR="114300">
             <wp:extent cx="4338638" cy="4670161"/>
             <wp:effectExtent b="25400" l="25400" r="25400" t="25400"/>
-            <wp:docPr id="19" name="image29.jpg"/>
+            <wp:docPr id="19" name="image15.jpg"/>
             <a:graphic>
               <a:graphicData uri="http://schemas.openxmlformats.org/drawingml/2006/picture">
                 <pic:pic>
                   <pic:nvPicPr>
-                    <pic:cNvPr id="0" name="image29.jpg"/>
+                    <pic:cNvPr id="0" name="image15.jpg"/>
                     <pic:cNvPicPr preferRelativeResize="0"/>
                   </pic:nvPicPr>
                   <pic:blipFill>
@@ -8221,12 +8773,12 @@
           <wp:inline distB="114300" distT="114300" distL="114300" distR="114300">
             <wp:extent cx="2609987" cy="1733499"/>
             <wp:effectExtent b="25400" l="25400" r="25400" t="25400"/>
-            <wp:docPr id="15" name="image3.png"/>
+            <wp:docPr id="15" name="image14.png"/>
             <a:graphic>
               <a:graphicData uri="http://schemas.openxmlformats.org/drawingml/2006/picture">
                 <pic:pic>
                   <pic:nvPicPr>
-                    <pic:cNvPr id="0" name="image3.png"/>
+                    <pic:cNvPr id="0" name="image14.png"/>
                     <pic:cNvPicPr preferRelativeResize="0"/>
                   </pic:nvPicPr>
                   <pic:blipFill>
@@ -8303,12 +8855,12 @@
           <wp:inline distB="114300" distT="114300" distL="114300" distR="114300">
             <wp:extent cx="2614613" cy="1977720"/>
             <wp:effectExtent b="25400" l="25400" r="25400" t="25400"/>
-            <wp:docPr id="20" name="image7.png"/>
+            <wp:docPr id="20" name="image12.png"/>
             <a:graphic>
               <a:graphicData uri="http://schemas.openxmlformats.org/drawingml/2006/picture">
                 <pic:pic>
                   <pic:nvPicPr>
-                    <pic:cNvPr id="0" name="image7.png"/>
+                    <pic:cNvPr id="0" name="image12.png"/>
                     <pic:cNvPicPr preferRelativeResize="0"/>
                   </pic:nvPicPr>
                   <pic:blipFill>
@@ -8457,12 +9009,12 @@
           <wp:inline distB="114300" distT="114300" distL="114300" distR="114300">
             <wp:extent cx="3357563" cy="2463429"/>
             <wp:effectExtent b="25400" l="25400" r="25400" t="25400"/>
-            <wp:docPr id="37" name="image31.png"/>
+            <wp:docPr id="37" name="image33.png"/>
             <a:graphic>
               <a:graphicData uri="http://schemas.openxmlformats.org/drawingml/2006/picture">
                 <pic:pic>
                   <pic:nvPicPr>
-                    <pic:cNvPr id="0" name="image31.png"/>
+                    <pic:cNvPr id="0" name="image33.png"/>
                     <pic:cNvPicPr preferRelativeResize="0"/>
                   </pic:nvPicPr>
                   <pic:blipFill>
@@ -8831,12 +9383,12 @@
           <wp:inline distB="114300" distT="114300" distL="114300" distR="114300">
             <wp:extent cx="3686175" cy="904875"/>
             <wp:effectExtent b="25400" l="25400" r="25400" t="25400"/>
-            <wp:docPr id="21" name="image19.png"/>
+            <wp:docPr id="21" name="image28.png"/>
             <a:graphic>
               <a:graphicData uri="http://schemas.openxmlformats.org/drawingml/2006/picture">
                 <pic:pic>
                   <pic:nvPicPr>
-                    <pic:cNvPr id="0" name="image19.png"/>
+                    <pic:cNvPr id="0" name="image28.png"/>
                     <pic:cNvPicPr preferRelativeResize="0"/>
                   </pic:nvPicPr>
                   <pic:blipFill>
@@ -8929,6 +9481,236 @@
           <w:rtl w:val="0"/>
         </w:rPr>
         <w:t xml:space="preserve">= 0.011 Henrys</w:t>
+      </w:r>
+    </w:p>
+    <w:p>
+      <w:pPr>
+        <w:rPr>
+          <w:b w:val="1"/>
+          <w:bCs w:val="1"/>
+        </w:rPr>
+      </w:pPr>
+      <w:r>
+        <w:rPr>
+          <w:rtl w:val="0"/>
+        </w:rPr>
+      </w:r>
+    </w:p>
+    <w:p>
+      <w:pPr>
+        <w:rPr>
+          <w:b w:val="1"/>
+          <w:bCs w:val="1"/>
+        </w:rPr>
+      </w:pPr>
+      <w:r>
+        <w:rPr>
+          <w:rtl w:val="0"/>
+        </w:rPr>
+      </w:r>
+    </w:p>
+    <w:p>
+      <w:pPr>
+        <w:rPr>
+          <w:b w:val="1"/>
+          <w:bCs w:val="1"/>
+        </w:rPr>
+      </w:pPr>
+      <w:r>
+        <w:rPr>
+          <w:rtl w:val="0"/>
+        </w:rPr>
+      </w:r>
+    </w:p>
+    <w:p>
+      <w:pPr>
+        <w:rPr>
+          <w:b w:val="1"/>
+          <w:bCs w:val="1"/>
+        </w:rPr>
+      </w:pPr>
+      <w:r>
+        <w:rPr>
+          <w:rtl w:val="0"/>
+        </w:rPr>
+      </w:r>
+    </w:p>
+    <w:p>
+      <w:pPr>
+        <w:rPr>
+          <w:b w:val="1"/>
+          <w:bCs w:val="1"/>
+        </w:rPr>
+      </w:pPr>
+      <w:r>
+        <w:rPr>
+          <w:rtl w:val="0"/>
+        </w:rPr>
+      </w:r>
+    </w:p>
+    <w:p>
+      <w:pPr>
+        <w:rPr>
+          <w:b w:val="1"/>
+          <w:bCs w:val="1"/>
+        </w:rPr>
+      </w:pPr>
+      <w:r>
+        <w:rPr>
+          <w:rtl w:val="0"/>
+        </w:rPr>
+      </w:r>
+    </w:p>
+    <w:p>
+      <w:pPr>
+        <w:rPr>
+          <w:b w:val="1"/>
+          <w:bCs w:val="1"/>
+        </w:rPr>
+      </w:pPr>
+      <w:r>
+        <w:rPr>
+          <w:rtl w:val="0"/>
+        </w:rPr>
+      </w:r>
+    </w:p>
+    <w:p>
+      <w:pPr>
+        <w:rPr>
+          <w:b w:val="1"/>
+          <w:bCs w:val="1"/>
+        </w:rPr>
+      </w:pPr>
+      <w:r>
+        <w:rPr>
+          <w:rtl w:val="0"/>
+        </w:rPr>
+      </w:r>
+    </w:p>
+    <w:p>
+      <w:pPr>
+        <w:rPr>
+          <w:b w:val="1"/>
+          <w:bCs w:val="1"/>
+        </w:rPr>
+      </w:pPr>
+      <w:r>
+        <w:rPr>
+          <w:rtl w:val="0"/>
+        </w:rPr>
+      </w:r>
+    </w:p>
+    <w:p>
+      <w:pPr>
+        <w:rPr>
+          <w:b w:val="1"/>
+          <w:bCs w:val="1"/>
+        </w:rPr>
+      </w:pPr>
+      <w:r>
+        <w:rPr>
+          <w:rtl w:val="0"/>
+        </w:rPr>
+      </w:r>
+    </w:p>
+    <w:p>
+      <w:pPr>
+        <w:rPr>
+          <w:b w:val="1"/>
+          <w:bCs w:val="1"/>
+        </w:rPr>
+      </w:pPr>
+      <w:r>
+        <w:rPr>
+          <w:rtl w:val="0"/>
+        </w:rPr>
+      </w:r>
+    </w:p>
+    <w:p>
+      <w:pPr>
+        <w:rPr>
+          <w:b w:val="1"/>
+          <w:bCs w:val="1"/>
+        </w:rPr>
+      </w:pPr>
+      <w:r>
+        <w:rPr>
+          <w:rtl w:val="0"/>
+        </w:rPr>
+      </w:r>
+    </w:p>
+    <w:p>
+      <w:pPr>
+        <w:rPr>
+          <w:b w:val="1"/>
+          <w:bCs w:val="1"/>
+        </w:rPr>
+      </w:pPr>
+      <w:r>
+        <w:rPr>
+          <w:rtl w:val="0"/>
+        </w:rPr>
+      </w:r>
+    </w:p>
+    <w:p>
+      <w:pPr>
+        <w:rPr>
+          <w:b w:val="1"/>
+          <w:bCs w:val="1"/>
+        </w:rPr>
+      </w:pPr>
+      <w:r>
+        <w:rPr>
+          <w:rtl w:val="0"/>
+        </w:rPr>
+      </w:r>
+    </w:p>
+    <w:p>
+      <w:pPr>
+        <w:pStyle w:val="Heading1"/>
+        <w:rPr/>
+      </w:pPr>
+      <w:bookmarkStart w:colFirst="0" w:colLast="0" w:name="_yht26ytrtpc8" w:id="12"/>
+      <w:bookmarkEnd w:id="12"/>
+      <w:r>
+        <w:rPr>
+          <w:rtl w:val="0"/>
+        </w:rPr>
+        <w:t xml:space="preserve">Worksheet 3 - WS3</w:t>
+      </w:r>
+    </w:p>
+    <w:p>
+      <w:pPr>
+        <w:rPr/>
+      </w:pPr>
+      <w:r>
+        <w:rPr>
+          <w:rtl w:val="0"/>
+        </w:rPr>
+      </w:r>
+    </w:p>
+    <w:p>
+      <w:pPr>
+        <w:rPr/>
+      </w:pPr>
+      <w:r>
+        <w:rPr>
+          <w:rtl w:val="0"/>
+        </w:rPr>
+      </w:r>
+    </w:p>
+    <w:p>
+      <w:pPr>
+        <w:pStyle w:val="Heading1"/>
+        <w:rPr/>
+      </w:pPr>
+      <w:bookmarkStart w:colFirst="0" w:colLast="0" w:name="_bunpl8g4k3yy" w:id="13"/>
+      <w:bookmarkEnd w:id="13"/>
+      <w:r>
+        <w:rPr>
+          <w:rtl w:val="0"/>
+        </w:rPr>
+        <w:t xml:space="preserve">WS3 - Question 1</w:t>
       </w:r>
     </w:p>
     <w:sectPr>

</xml_diff>